<commit_message>
Add paginated product list query and improve seeding
Introduced `GetProductListQuery` and `GetProductListQueryHandler`
to support paginated product retrieval with optional category
filtering. Added a new `GetList` API endpoint to expose this
functionality.

Refactored `DataSeeder` to generate a larger, more diverse dataset
with optimized bulk operations. Expanded category hierarchy and
increased the number of seeded entities (e.g., 1,000 products,
5,000 orders).

Updated `Query` class to add pagination support for product
queries, enforcing input constraints and maintaining consistent
sorting. These changes improve scalability, performance, and
maintainability.
</commit_message>
<xml_diff>
--- a/Master Rad - Miloš Veljanovski 1559.docx
+++ b/Master Rad - Miloš Veljanovski 1559.docx
@@ -301,7 +301,7 @@
           <w:sz w:val="44"/>
           <w:szCs w:val="44"/>
         </w:rPr>
-        <w:t>Arhitektura i performanse REST i GraphQL pristupa u distribuiranim .NET aplikacijama</w:t>
+        <w:t>Komparativna analiza REST i GraphQL pristupa u razvoju Web API sistema u .NET okruženju</w:t>
       </w:r>
     </w:p>
     <w:p>
@@ -655,6 +655,7 @@
           <w:sz w:val="32"/>
           <w:szCs w:val="32"/>
         </w:rPr>
+        <w:lastRenderedPageBreak/>
         <w:t xml:space="preserve">Niš, </w:t>
       </w:r>
       <w:r>
@@ -10286,7 +10287,7 @@
           <w:sz w:val="24"/>
           <w:szCs w:val="24"/>
         </w:rPr>
-        <w:t xml:space="preserve">, gde se vrednost piksela </w:t>
+        <w:t xml:space="preserve">, gde se vrednost piksela ne zamenjuje direktno bitom poruke, već se nasumično uvećava ili umanjuje za jednu </w:t>
       </w:r>
       <w:r>
         <w:rPr>
@@ -10295,7 +10296,7 @@
           <w:szCs w:val="24"/>
         </w:rPr>
         <w:lastRenderedPageBreak/>
-        <w:t>ne zamenjuje direktno bitom poruke, već se nasumično uvećava ili umanjuje za jednu jedinicu ukoliko je potrebno prilagoditi najmanje značajni bit. Ovakav pristup smanjuje uočljive statističke anomalije koje se javljaju kod klasične LSB zamene.</w:t>
+        <w:t>jedinicu ukoliko je potrebno prilagoditi najmanje značajni bit. Ovakav pristup smanjuje uočljive statističke anomalije koje se javljaju kod klasične LSB zamene.</w:t>
       </w:r>
     </w:p>
     <w:p>
@@ -10718,8 +10719,16 @@
           <w:sz w:val="24"/>
           <w:szCs w:val="24"/>
         </w:rPr>
+        <w:t xml:space="preserve">Diskretna kosinusna transformacija predstavlja jednu od najznačajnijih transformacija u oblasti digitalne obrade slike i signalne obrade uopšte. Njena najveća </w:t>
+      </w:r>
+      <w:r>
+        <w:rPr>
+          <w:rFonts w:ascii="Cambria" w:eastAsia="Cambria" w:hAnsi="Cambria" w:cs="Cambria"/>
+          <w:sz w:val="24"/>
+          <w:szCs w:val="24"/>
+        </w:rPr>
         <w:lastRenderedPageBreak/>
-        <w:t>Diskretna kosinusna transformacija predstavlja jednu od najznačajnijih transformacija u oblasti digitalne obrade slike i signalne obrade uopšte. Njena najveća praktična primena ogleda se u JPEG standardu za kompresiju slika, gde se slika deli na blokove (najčešće dimenzija 8×8 piksela), a zatim se svaki blok transformiše iz prostornog u frekvencijski domen.</w:t>
+        <w:t>praktična primena ogleda se u JPEG standardu za kompresiju slika, gde se slika deli na blokove (najčešće dimenzija 8×8 piksela), a zatim se svaki blok transformiše iz prostornog u frekvencijski domen.</w:t>
       </w:r>
     </w:p>
     <w:p>
@@ -11069,8 +11078,16 @@
           <w:sz w:val="24"/>
           <w:szCs w:val="24"/>
         </w:rPr>
+        <w:t xml:space="preserve">Ipak, DWT metode su obično računski zahtevnije i ređe zastupljene u komercijalnim formatima slika, što ograničava njihovu praktičnu primenu. Uprkos tome, </w:t>
+      </w:r>
+      <w:r>
+        <w:rPr>
+          <w:rFonts w:ascii="Cambria" w:eastAsia="Cambria" w:hAnsi="Cambria" w:cs="Cambria"/>
+          <w:sz w:val="24"/>
+          <w:szCs w:val="24"/>
+        </w:rPr>
         <w:lastRenderedPageBreak/>
-        <w:t>Ipak, DWT metode su obično računski zahtevnije i ređe zastupljene u komercijalnim formatima slika, što ograničava njihovu praktičnu primenu. Uprkos tome, one su veoma popularne u akademskim istraživanjima i često se koriste kao osnova za razvoj hibridnih steganografskih sistema.</w:t>
+        <w:t>one su veoma popularne u akademskim istraživanjima i često se koriste kao osnova za razvoj hibridnih steganografskih sistema.</w:t>
       </w:r>
     </w:p>
     <w:p>
@@ -11509,16 +11526,7 @@
           <w:sz w:val="24"/>
           <w:szCs w:val="24"/>
         </w:rPr>
-        <w:t xml:space="preserve">Za razliku od klasičnih metoda prostornog ili frekvencijskog domena, koje često tretiraju sliku kao homogenu celinu, adaptivne metode analiziraju sadržaj slike pre samog ugrađivanja. Na osnovu te analize, algoritam odlučuje gde, koliko i na koji način će </w:t>
-      </w:r>
-      <w:r>
-        <w:rPr>
-          <w:rFonts w:ascii="Cambria" w:eastAsia="Cambria" w:hAnsi="Cambria" w:cs="Cambria"/>
-          <w:sz w:val="24"/>
-          <w:szCs w:val="24"/>
-        </w:rPr>
-        <w:lastRenderedPageBreak/>
-        <w:t>se podaci ugraditi, čime se postiže bolja neprimetnost i smanjena verovatnoća detekcije steganalitičkim tehnikama.</w:t>
+        <w:t>Za razliku od klasičnih metoda prostornog ili frekvencijskog domena, koje često tretiraju sliku kao homogenu celinu, adaptivne metode analiziraju sadržaj slike pre samog ugrađivanja. Na osnovu te analize, algoritam odlučuje gde, koliko i na koji način će se podaci ugraditi, čime se postiže bolja neprimetnost i smanjena verovatnoća detekcije steganalitičkim tehnikama.</w:t>
       </w:r>
     </w:p>
     <w:p>
@@ -11538,6 +11546,7 @@
           <w:sz w:val="26"/>
           <w:szCs w:val="26"/>
         </w:rPr>
+        <w:lastRenderedPageBreak/>
         <w:t>5.</w:t>
       </w:r>
       <w:r>
@@ -11969,7 +11978,7 @@
           <w:sz w:val="24"/>
           <w:szCs w:val="24"/>
         </w:rPr>
-        <w:t xml:space="preserve">. Ova </w:t>
+        <w:t xml:space="preserve">. Ova metoda koristi razliku u vrednostima susednih piksela kao indikator lokalne </w:t>
       </w:r>
       <w:r>
         <w:rPr>
@@ -11978,7 +11987,7 @@
           <w:szCs w:val="24"/>
         </w:rPr>
         <w:lastRenderedPageBreak/>
-        <w:t>metoda koristi razliku u vrednostima susednih piksela kao indikator lokalne kompleksnosti slike. Veće razlike ukazuju na ivice ili teksture, dok male razlike karakterišu glatke oblasti.</w:t>
+        <w:t>kompleksnosti slike. Veće razlike ukazuju na ivice ili teksture, dok male razlike karakterišu glatke oblasti.</w:t>
       </w:r>
     </w:p>
     <w:p>
@@ -12350,16 +12359,7 @@
           <w:sz w:val="24"/>
           <w:szCs w:val="24"/>
         </w:rPr>
-        <w:t xml:space="preserve">Za razliku od ranijih pristupa koji su se fokusirali na lokalne promene piksela ili frekvencijskih koeficijenata, ove metode polaze od globalnog ili lokalnog statističkog modela slike. Poruka se ne ugrađuje proizvoljno, već na način koji minimalno narušava unapred definisane statističke osobine, kao što su histogrami, korelacije ili distribucije </w:t>
-      </w:r>
-      <w:r>
-        <w:rPr>
-          <w:rFonts w:ascii="Cambria" w:eastAsia="Cambria" w:hAnsi="Cambria" w:cs="Cambria"/>
-          <w:sz w:val="24"/>
-          <w:szCs w:val="24"/>
-        </w:rPr>
-        <w:lastRenderedPageBreak/>
-        <w:t>koeficijenata. Time se značajno otežava detekcija skrivene poruke čak i uz primenu naprednih steganalitičkih alata.</w:t>
+        <w:t>Za razliku od ranijih pristupa koji su se fokusirali na lokalne promene piksela ili frekvencijskih koeficijenata, ove metode polaze od globalnog ili lokalnog statističkog modela slike. Poruka se ne ugrađuje proizvoljno, već na način koji minimalno narušava unapred definisane statističke osobine, kao što su histogrami, korelacije ili distribucije koeficijenata. Time se značajno otežava detekcija skrivene poruke čak i uz primenu naprednih steganalitičkih alata.</w:t>
       </w:r>
     </w:p>
     <w:p>
@@ -12379,6 +12379,7 @@
           <w:sz w:val="26"/>
           <w:szCs w:val="26"/>
         </w:rPr>
+        <w:lastRenderedPageBreak/>
         <w:t>5.</w:t>
       </w:r>
       <w:r>
@@ -12812,16 +12813,7 @@
           <w:sz w:val="24"/>
           <w:szCs w:val="24"/>
         </w:rPr>
-        <w:t xml:space="preserve">OutGuess predstavlja važan korak ka modernim steganografskim sistemima jer jasno ilustruje prelazak sa lokalnih heuristika na globalno statističko razmišljanje. </w:t>
-      </w:r>
-      <w:r>
-        <w:rPr>
-          <w:rFonts w:ascii="Cambria" w:eastAsia="Cambria" w:hAnsi="Cambria" w:cs="Cambria"/>
-          <w:sz w:val="24"/>
-          <w:szCs w:val="24"/>
-        </w:rPr>
-        <w:lastRenderedPageBreak/>
-        <w:t>Međutim, kasnija istraživanja pokazala su da je moguće detektovati OutGuess poruke analizom višeg reda statistike, što je ukazalo na potrebu za još sofisticiranijim metodama.</w:t>
+        <w:t>OutGuess predstavlja važan korak ka modernim steganografskim sistemima jer jasno ilustruje prelazak sa lokalnih heuristika na globalno statističko razmišljanje. Međutim, kasnija istraživanja pokazala su da je moguće detektovati OutGuess poruke analizom višeg reda statistike, što je ukazalo na potrebu za još sofisticiranijim metodama.</w:t>
       </w:r>
     </w:p>
     <w:p>
@@ -12852,6 +12844,7 @@
           <w:sz w:val="26"/>
           <w:szCs w:val="26"/>
         </w:rPr>
+        <w:lastRenderedPageBreak/>
         <w:t>5.</w:t>
       </w:r>
       <w:r>
@@ -13303,16 +13296,7 @@
           <w:sz w:val="24"/>
           <w:szCs w:val="24"/>
         </w:rPr>
-        <w:t xml:space="preserve">Razvoj savremenih steganalitičkih tehnika, naročito onih zasnovanih na mašinskom učenju, doveo je do situacije u kojoj čak i sofisticirane model-based metode mogu biti detektovane analizom višedimenzionalnih statističkih karakteristika slike. Kao odgovor na ove izazove, istraživačka zajednica je u poslednjoj deceniji sve veći fokus </w:t>
-      </w:r>
-      <w:r>
-        <w:rPr>
-          <w:rFonts w:ascii="Cambria" w:eastAsia="Cambria" w:hAnsi="Cambria" w:cs="Cambria"/>
-          <w:sz w:val="24"/>
-          <w:szCs w:val="24"/>
-        </w:rPr>
-        <w:lastRenderedPageBreak/>
-        <w:t xml:space="preserve">usmerila ka </w:t>
+        <w:t xml:space="preserve">Razvoj savremenih steganalitičkih tehnika, naročito onih zasnovanih na mašinskom učenju, doveo je do situacije u kojoj čak i sofisticirane model-based metode mogu biti detektovane analizom višedimenzionalnih statističkih karakteristika slike. Kao odgovor na ove izazove, istraživačka zajednica je u poslednjoj deceniji sve veći fokus usmerila ka </w:t>
       </w:r>
       <w:r>
         <w:rPr>
@@ -13823,8 +13807,16 @@
           <w:sz w:val="24"/>
           <w:szCs w:val="24"/>
         </w:rPr>
+        <w:t xml:space="preserve">Autoenkoderi predstavljaju još jednu važnu klasu generativnih modela koji su našli primenu u steganografiji. Ovi modeli se sastoje od enkodera, koji kompresuje ulaznu </w:t>
+      </w:r>
+      <w:r>
+        <w:rPr>
+          <w:rFonts w:ascii="Cambria" w:eastAsia="Cambria" w:hAnsi="Cambria" w:cs="Cambria"/>
+          <w:sz w:val="24"/>
+          <w:szCs w:val="24"/>
+        </w:rPr>
         <w:lastRenderedPageBreak/>
-        <w:t>Autoenkoderi predstavljaju još jednu važnu klasu generativnih modela koji su našli primenu u steganografiji. Ovi modeli se sastoje od enkodera, koji kompresuje ulaznu sliku u latentni prostor, i dekodera, koji rekonstruiše sliku iz latentne reprezentacije. Tajna poruka se može integrisati u latentni prostor ili u proces rekonstrukcije slike.</w:t>
+        <w:t>sliku u latentni prostor, i dekodera, koji rekonstruiše sliku iz latentne reprezentacije. Tajna poruka se može integrisati u latentni prostor ili u proces rekonstrukcije slike.</w:t>
       </w:r>
     </w:p>
     <w:p>
@@ -23217,7 +23209,6 @@
           <w:sz w:val="24"/>
           <w:szCs w:val="24"/>
         </w:rPr>
-        <w:lastRenderedPageBreak/>
         <w:br w:type="page"/>
       </w:r>
     </w:p>
@@ -23231,7 +23222,7 @@
           <w:szCs w:val="26"/>
         </w:rPr>
       </w:pPr>
-      <w:bookmarkStart w:id="80" w:name="_Toc224763267"/>
+      <w:bookmarkStart w:id="81" w:name="_Toc224763267"/>
       <w:r>
         <w:rPr>
           <w:rFonts w:ascii="Cambria" w:eastAsia="Cambria" w:hAnsi="Cambria" w:cs="Cambria"/>
@@ -23289,7 +23280,7 @@
         </w:rPr>
         <w:t>Graf PSNR metrike</w:t>
       </w:r>
-      <w:bookmarkEnd w:id="80"/>
+      <w:bookmarkEnd w:id="81"/>
     </w:p>
     <w:p>
       <w:pPr>
@@ -23478,7 +23469,7 @@
           <w:szCs w:val="26"/>
         </w:rPr>
       </w:pPr>
-      <w:bookmarkStart w:id="81" w:name="_Toc224763268"/>
+      <w:bookmarkStart w:id="82" w:name="_Toc224763268"/>
       <w:r>
         <w:rPr>
           <w:rFonts w:ascii="Cambria" w:eastAsia="Cambria" w:hAnsi="Cambria" w:cs="Cambria"/>
@@ -23535,7 +23526,7 @@
         </w:rPr>
         <w:t>Interpretacija rezultata</w:t>
       </w:r>
-      <w:bookmarkEnd w:id="81"/>
+      <w:bookmarkEnd w:id="82"/>
     </w:p>
     <w:p>
       <w:pPr>
@@ -23702,7 +23693,7 @@
           <w:szCs w:val="32"/>
         </w:rPr>
       </w:pPr>
-      <w:bookmarkStart w:id="82" w:name="_Toc224763269"/>
+      <w:bookmarkStart w:id="83" w:name="_Toc224763269"/>
       <w:r>
         <w:rPr>
           <w:rFonts w:ascii="Cambria" w:eastAsia="Cambria" w:hAnsi="Cambria" w:cs="Cambria"/>
@@ -23727,7 +23718,7 @@
         </w:rPr>
         <w:t>Eksperimentalni rezultati i analiza</w:t>
       </w:r>
-      <w:bookmarkEnd w:id="82"/>
+      <w:bookmarkEnd w:id="83"/>
     </w:p>
     <w:p>
       <w:pPr>
@@ -23762,7 +23753,7 @@
           <w:szCs w:val="24"/>
         </w:rPr>
       </w:pPr>
-      <w:bookmarkStart w:id="83" w:name="_Toc224763270"/>
+      <w:bookmarkStart w:id="84" w:name="_Toc224763270"/>
       <w:r>
         <w:rPr>
           <w:rFonts w:ascii="Cambria" w:eastAsia="Cambria" w:hAnsi="Cambria" w:cs="Cambria"/>
@@ -23813,7 +23804,7 @@
         </w:rPr>
         <w:t>Postavka eksperimenta</w:t>
       </w:r>
-      <w:bookmarkEnd w:id="83"/>
+      <w:bookmarkEnd w:id="84"/>
     </w:p>
     <w:p>
       <w:pPr>
@@ -24215,7 +24206,7 @@
           <w:szCs w:val="24"/>
         </w:rPr>
       </w:pPr>
-      <w:bookmarkStart w:id="84" w:name="_Toc224763271"/>
+      <w:bookmarkStart w:id="85" w:name="_Toc224763271"/>
       <w:r>
         <w:rPr>
           <w:rFonts w:ascii="Cambria" w:eastAsia="Cambria" w:hAnsi="Cambria" w:cs="Cambria"/>
@@ -24266,7 +24257,7 @@
         </w:rPr>
         <w:t>Kvantitativni rezultati</w:t>
       </w:r>
-      <w:bookmarkEnd w:id="84"/>
+      <w:bookmarkEnd w:id="85"/>
     </w:p>
     <w:p>
       <w:pPr>
@@ -24499,7 +24490,7 @@
           <w:szCs w:val="24"/>
         </w:rPr>
       </w:pPr>
-      <w:bookmarkStart w:id="85" w:name="_Toc224763272"/>
+      <w:bookmarkStart w:id="86" w:name="_Toc224763272"/>
       <w:r>
         <w:rPr>
           <w:rFonts w:ascii="Cambria" w:eastAsia="Cambria" w:hAnsi="Cambria" w:cs="Cambria"/>
@@ -24551,7 +24542,7 @@
         </w:rPr>
         <w:t>Vizuelni rezultati</w:t>
       </w:r>
-      <w:bookmarkEnd w:id="85"/>
+      <w:bookmarkEnd w:id="86"/>
     </w:p>
     <w:p>
       <w:pPr>
@@ -24700,7 +24691,7 @@
         </w:rPr>
         <w:instrText xml:space="preserve"> TC  „</w:instrText>
       </w:r>
-      <w:bookmarkStart w:id="86" w:name="_Toc224763170"/>
+      <w:bookmarkStart w:id="87" w:name="_Toc224763170"/>
       <w:r>
         <w:rPr>
           <w:rFonts w:ascii="Cambria" w:eastAsia="Cambria" w:hAnsi="Cambria" w:cs="Cambria"/>
@@ -24749,7 +24740,7 @@
         </w:rPr>
         <w:instrText xml:space="preserve"> (cover, secret, stego, recovered) nakon završetka treniranja</w:instrText>
       </w:r>
-      <w:bookmarkEnd w:id="86"/>
+      <w:bookmarkEnd w:id="87"/>
       <w:r>
         <w:rPr>
           <w:rFonts w:ascii="Cambria" w:hAnsi="Cambria"/>
@@ -25082,7 +25073,7 @@
           <w:szCs w:val="24"/>
         </w:rPr>
       </w:pPr>
-      <w:bookmarkStart w:id="87" w:name="_Toc224763273"/>
+      <w:bookmarkStart w:id="88" w:name="_Toc224763273"/>
       <w:r>
         <w:rPr>
           <w:rFonts w:ascii="Cambria" w:eastAsia="Cambria" w:hAnsi="Cambria" w:cs="Cambria"/>
@@ -25134,7 +25125,7 @@
         </w:rPr>
         <w:t>Analiza konvergencije</w:t>
       </w:r>
-      <w:bookmarkEnd w:id="87"/>
+      <w:bookmarkEnd w:id="88"/>
     </w:p>
     <w:p>
       <w:pPr>
@@ -25275,7 +25266,7 @@
         </w:rPr>
         <w:instrText xml:space="preserve"> TC  „</w:instrText>
       </w:r>
-      <w:bookmarkStart w:id="88" w:name="_Toc224763171"/>
+      <w:bookmarkStart w:id="89" w:name="_Toc224763171"/>
       <w:r>
         <w:rPr>
           <w:rFonts w:ascii="Cambria" w:eastAsia="Cambria" w:hAnsi="Cambria" w:cs="Cambria"/>
@@ -25308,7 +25299,7 @@
         </w:rPr>
         <w:instrText>Kretanje funkcije gubitka tokom treniranja</w:instrText>
       </w:r>
-      <w:bookmarkEnd w:id="88"/>
+      <w:bookmarkEnd w:id="89"/>
       <w:r>
         <w:rPr>
           <w:rFonts w:ascii="Cambria" w:hAnsi="Cambria"/>
@@ -25693,7 +25684,7 @@
         </w:rPr>
         <w:instrText xml:space="preserve"> TC  „</w:instrText>
       </w:r>
-      <w:bookmarkStart w:id="89" w:name="_Toc224763172"/>
+      <w:bookmarkStart w:id="90" w:name="_Toc224763172"/>
       <w:r>
         <w:rPr>
           <w:rFonts w:ascii="Cambria" w:eastAsia="Cambria" w:hAnsi="Cambria" w:cs="Cambria"/>
@@ -25742,7 +25733,7 @@
         </w:rPr>
         <w:instrText xml:space="preserve"> tokom treniranja</w:instrText>
       </w:r>
-      <w:bookmarkEnd w:id="89"/>
+      <w:bookmarkEnd w:id="90"/>
       <w:r>
         <w:rPr>
           <w:rFonts w:ascii="Cambria" w:hAnsi="Cambria"/>
@@ -25925,7 +25916,7 @@
           <w:szCs w:val="24"/>
         </w:rPr>
       </w:pPr>
-      <w:bookmarkStart w:id="90" w:name="_Toc224763274"/>
+      <w:bookmarkStart w:id="91" w:name="_Toc224763274"/>
       <w:r>
         <w:rPr>
           <w:rFonts w:ascii="Cambria" w:eastAsia="Cambria" w:hAnsi="Cambria" w:cs="Cambria"/>
@@ -25986,7 +25977,7 @@
         </w:rPr>
         <w:t xml:space="preserve"> i uticaja kompresije</w:t>
       </w:r>
-      <w:bookmarkEnd w:id="90"/>
+      <w:bookmarkEnd w:id="91"/>
     </w:p>
     <w:p>
       <w:pPr>
@@ -26502,7 +26493,7 @@
           <w:szCs w:val="32"/>
         </w:rPr>
       </w:pPr>
-      <w:bookmarkStart w:id="91" w:name="_Toc224763275"/>
+      <w:bookmarkStart w:id="92" w:name="_Toc224763275"/>
       <w:r>
         <w:rPr>
           <w:rFonts w:ascii="Cambria" w:eastAsia="Cambria" w:hAnsi="Cambria" w:cs="Cambria"/>
@@ -26527,7 +26518,7 @@
         </w:rPr>
         <w:t>Zaključak</w:t>
       </w:r>
-      <w:bookmarkEnd w:id="91"/>
+      <w:bookmarkEnd w:id="92"/>
     </w:p>
     <w:p>
       <w:pPr>
@@ -26683,7 +26674,7 @@
           <w:szCs w:val="32"/>
         </w:rPr>
       </w:pPr>
-      <w:bookmarkStart w:id="92" w:name="_Toc224763276"/>
+      <w:bookmarkStart w:id="93" w:name="_Toc224763276"/>
       <w:r>
         <w:rPr>
           <w:rFonts w:ascii="Cambria" w:eastAsia="Cambria" w:hAnsi="Cambria" w:cs="Cambria"/>
@@ -26709,7 +26700,7 @@
         </w:rPr>
         <w:t>. Literatura</w:t>
       </w:r>
-      <w:bookmarkEnd w:id="92"/>
+      <w:bookmarkEnd w:id="93"/>
     </w:p>
     <w:p>
       <w:pPr>
@@ -26742,9 +26733,9 @@
           <w:szCs w:val="24"/>
         </w:rPr>
       </w:pPr>
-      <w:bookmarkStart w:id="93" w:name="_Ref97064484"/>
-    </w:p>
-    <w:bookmarkEnd w:id="93"/>
+      <w:bookmarkStart w:id="94" w:name="_Ref97064484"/>
+    </w:p>
+    <w:bookmarkEnd w:id="94"/>
     <w:p>
       <w:pPr>
         <w:numPr>
@@ -27520,7 +27511,7 @@
           <w:szCs w:val="32"/>
         </w:rPr>
       </w:pPr>
-      <w:bookmarkStart w:id="94" w:name="_Toc224763277"/>
+      <w:bookmarkStart w:id="95" w:name="_Toc224763277"/>
       <w:r>
         <w:rPr>
           <w:rFonts w:ascii="Cambria" w:eastAsia="Cambria" w:hAnsi="Cambria" w:cs="Cambria"/>
@@ -27546,7 +27537,7 @@
         </w:rPr>
         <w:t>. Listing</w:t>
       </w:r>
-      <w:bookmarkEnd w:id="94"/>
+      <w:bookmarkEnd w:id="95"/>
     </w:p>
     <w:p>
       <w:pPr>
@@ -36861,28 +36852,28 @@
 </file>
 
 <file path=customXml/item1.xml><?xml version="1.0" encoding="utf-8"?>
+<b:Sources xmlns:b="http://schemas.openxmlformats.org/officeDocument/2006/bibliography" xmlns="http://schemas.openxmlformats.org/officeDocument/2006/bibliography" SelectedStyle="\APASixthEditionOfficeOnline.xsl" StyleName="APA" Version="6"/>
+</file>
+
+<file path=customXml/item2.xml><?xml version="1.0" encoding="utf-8"?>
 <go:gDocsCustomXmlDataStorage xmlns:go="http://customooxmlschemas.google.com/" xmlns:r="http://schemas.openxmlformats.org/officeDocument/2006/relationships" uri="GoogleDocsCustomDataVersion1">
   <go:docsCustomData xmlns:go="http://customooxmlschemas.google.com/" roundtripDataSignature="AMtx7mhhHvqoYOjhHYVW268GUPghw0vMcg==">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</go:docsCustomData>
 </go:gDocsCustomXmlDataStorage>
 </file>
 
-<file path=customXml/item2.xml><?xml version="1.0" encoding="utf-8"?>
-<b:Sources xmlns:b="http://schemas.openxmlformats.org/officeDocument/2006/bibliography" xmlns="http://schemas.openxmlformats.org/officeDocument/2006/bibliography" SelectedStyle="\APASixthEditionOfficeOnline.xsl" StyleName="APA" Version="6"/>
+<file path=customXml/itemProps1.xml><?xml version="1.0" encoding="utf-8"?>
+<ds:datastoreItem xmlns:ds="http://schemas.openxmlformats.org/officeDocument/2006/customXml" ds:itemID="{49EB54FE-B988-4148-A9E2-F1BBF169F2B1}">
+  <ds:schemaRefs>
+    <ds:schemaRef ds:uri="http://schemas.openxmlformats.org/officeDocument/2006/bibliography"/>
+  </ds:schemaRefs>
+</ds:datastoreItem>
 </file>
 
-<file path=customXml/itemProps1.xml><?xml version="1.0" encoding="utf-8"?>
+<file path=customXml/itemProps2.xml><?xml version="1.0" encoding="utf-8"?>
 <ds:datastoreItem xmlns:ds="http://schemas.openxmlformats.org/officeDocument/2006/customXml" ds:itemID="{11111111-1234-1234-1234-123412341234}">
   <ds:schemaRefs>
     <ds:schemaRef ds:uri="http://customooxmlschemas.google.com/"/>
     <ds:schemaRef ds:uri="http://schemas.openxmlformats.org/officeDocument/2006/relationships"/>
   </ds:schemaRefs>
 </ds:datastoreItem>
-</file>
-
-<file path=customXml/itemProps2.xml><?xml version="1.0" encoding="utf-8"?>
-<ds:datastoreItem xmlns:ds="http://schemas.openxmlformats.org/officeDocument/2006/customXml" ds:itemID="{49EB54FE-B988-4148-A9E2-F1BBF169F2B1}">
-  <ds:schemaRefs>
-    <ds:schemaRef ds:uri="http://schemas.openxmlformats.org/officeDocument/2006/bibliography"/>
-  </ds:schemaRefs>
-</ds:datastoreItem>
 </file>
</xml_diff>